<commit_message>
Correcciones en archivo de casos de prueba
</commit_message>
<xml_diff>
--- a/Test-Plan-UniFootball.docx
+++ b/Test-Plan-UniFootball.docx
@@ -153,12 +153,13 @@
             <w:tcW w:type="dxa" w:w="4320"/>
           </w:tcPr>
           <w:p>
-            <w:r/>
+            <w:r>
+              <w:t>Test Plan v1.1</w:t>
+            </w:r>
             <w:r>
               <w:rPr>
                 <w:sz w:val="19"/>
               </w:rPr>
-              <w:t>Test Plan v1.0</w:t>
             </w:r>
           </w:p>
         </w:tc>
@@ -921,12 +922,13 @@
             <w:tcW w:type="dxa" w:w="2160"/>
           </w:tcPr>
           <w:p>
-            <w:r/>
+            <w:r>
+              <w:t>Supertest + Docker local (Postgres/Mongo)</w:t>
+            </w:r>
             <w:r>
               <w:rPr>
                 <w:sz w:val="19"/>
               </w:rPr>
-              <w:t>Supertest + Testcontainers</w:t>
             </w:r>
           </w:p>
         </w:tc>
@@ -1095,12 +1097,13 @@
             <w:tcW w:type="dxa" w:w="2160"/>
           </w:tcPr>
           <w:p>
-            <w:r/>
+            <w:r>
+              <w:t>Postman/curl + Vitest (XSS) + npm audit</w:t>
+            </w:r>
             <w:r>
               <w:rPr>
                 <w:sz w:val="19"/>
               </w:rPr>
-              <w:t>OWASP ZAP + npm audit</w:t>
             </w:r>
           </w:p>
         </w:tc>
@@ -1965,12 +1968,13 @@
             <w:tcW w:type="dxa" w:w="2160"/>
           </w:tcPr>
           <w:p>
-            <w:r/>
+            <w:r>
+              <w:t>Seed (npm run seed) + Docker local (uf-postgres:5433 / uf-mongo:27018)</w:t>
+            </w:r>
             <w:r>
               <w:rPr>
                 <w:sz w:val="19"/>
               </w:rPr>
-              <w:t>Seed (npm run seed) + Testcontainers</w:t>
             </w:r>
           </w:p>
         </w:tc>
@@ -2114,6 +2118,10 @@
           <w:sz w:val="20"/>
         </w:rPr>
         <w:t>Credenciales demo del seed: admin@unifootball.com, referee1@unifootball.com y un jugador (.../@uni.edu), todas con password Password123.</w:t>
+      </w:r>
+      <w:r>
+        <w:br/>
+        <w:t>Nota de ejecucion real: las pruebas de este entregable se ejecutaron unicamente en el entorno Local (Docker: uf-postgres:5433 y uf-mongo:27018). Staging y Produccion se documentan como entornos objetivo del plan, pero no se aprovisionaron para esta entrega.</w:t>
       </w:r>
     </w:p>
     <w:p>
@@ -2267,12 +2275,13 @@
             <w:tcW w:type="dxa" w:w="2880"/>
           </w:tcPr>
           <w:p>
-            <w:r/>
+            <w:r>
+              <w:t>Prueba los endpoints HTTP de la API REST; en este proyecto se ejecuta contra la API corriendo en localhost:3000 (caja negra).</w:t>
+            </w:r>
             <w:r>
               <w:rPr>
                 <w:sz w:val="19"/>
               </w:rPr>
-              <w:t>Permite probar los endpoints HTTP de NestJS sin levantar un servidor real.</w:t>
             </w:r>
           </w:p>
         </w:tc>
@@ -2283,12 +2292,13 @@
             <w:tcW w:type="dxa" w:w="2880"/>
           </w:tcPr>
           <w:p>
-            <w:r/>
+            <w:r>
+              <w:t>Docker (Postgres/Mongo)</w:t>
+            </w:r>
             <w:r>
               <w:rPr>
                 <w:sz w:val="19"/>
               </w:rPr>
-              <w:t>Testcontainers</w:t>
             </w:r>
           </w:p>
         </w:tc>
@@ -2297,12 +2307,13 @@
             <w:tcW w:type="dxa" w:w="2880"/>
           </w:tcPr>
           <w:p>
-            <w:r/>
+            <w:r>
+              <w:t>BD real en pruebas de integracion</w:t>
+            </w:r>
             <w:r>
               <w:rPr>
                 <w:sz w:val="19"/>
               </w:rPr>
-              <w:t>BD real en pruebas de integracion</w:t>
             </w:r>
           </w:p>
         </w:tc>
@@ -2311,12 +2322,13 @@
             <w:tcW w:type="dxa" w:w="2880"/>
           </w:tcPr>
           <w:p>
-            <w:r/>
+            <w:r>
+              <w:t>Postgres y MongoDB en contenedores Docker locales (uf-postgres/uf-mongo, levantados con docker start) para probar contra una BD real; cada test crea y limpia sus propios datos para aislarse.</w:t>
+            </w:r>
             <w:r>
               <w:rPr>
                 <w:sz w:val="19"/>
               </w:rPr>
-              <w:t>Levanta Postgres y MongoDB en Docker para probar contra una BD real y aislada.</w:t>
             </w:r>
           </w:p>
         </w:tc>
@@ -2415,12 +2427,13 @@
             <w:tcW w:type="dxa" w:w="2880"/>
           </w:tcPr>
           <w:p>
-            <w:r/>
+            <w:r>
+              <w:t>Postman/curl + Vitest + npm audit</w:t>
+            </w:r>
             <w:r>
               <w:rPr>
                 <w:sz w:val="19"/>
               </w:rPr>
-              <w:t>OWASP ZAP + npm audit</w:t>
             </w:r>
           </w:p>
         </w:tc>
@@ -2429,12 +2442,13 @@
             <w:tcW w:type="dxa" w:w="2880"/>
           </w:tcPr>
           <w:p>
-            <w:r/>
+            <w:r>
+              <w:t>Pruebas de seguridad</w:t>
+            </w:r>
             <w:r>
               <w:rPr>
                 <w:sz w:val="19"/>
               </w:rPr>
-              <w:t>Pruebas de seguridad</w:t>
             </w:r>
           </w:p>
         </w:tc>
@@ -2443,12 +2457,13 @@
             <w:tcW w:type="dxa" w:w="2880"/>
           </w:tcPr>
           <w:p>
-            <w:r/>
+            <w:r>
+              <w:t>Pruebas manuales del OWASP Top 10 (Postman/curl), test automatizado de XSS (Vitest) y deteccion de dependencias vulnerables (npm audit).</w:t>
+            </w:r>
             <w:r>
               <w:rPr>
                 <w:sz w:val="19"/>
               </w:rPr>
-              <w:t>Escaneo OWASP Top 10 y deteccion de dependencias vulnerables.</w:t>
             </w:r>
           </w:p>
         </w:tc>
@@ -2537,6 +2552,38 @@
                 <w:sz w:val="19"/>
               </w:rPr>
               <w:t>Aplican strict TS, no-explicit-any y formato consistente.</w:t>
+            </w:r>
+          </w:p>
+        </w:tc>
+      </w:tr>
+      <w:tr>
+        <w:tc>
+          <w:tcPr>
+            <w:tcW w:type="dxa" w:w="2880"/>
+          </w:tcPr>
+          <w:p>
+            <w:r>
+              <w:t>jest-axe + Testing Library</w:t>
+            </w:r>
+          </w:p>
+        </w:tc>
+        <w:tc>
+          <w:tcPr>
+            <w:tcW w:type="dxa" w:w="2880"/>
+          </w:tcPr>
+          <w:p>
+            <w:r>
+              <w:t>Pruebas de accesibilidad (WCAG)</w:t>
+            </w:r>
+          </w:p>
+        </w:tc>
+        <w:tc>
+          <w:tcPr>
+            <w:tcW w:type="dxa" w:w="2880"/>
+          </w:tcPr>
+          <w:p>
+            <w:r>
+              <w:t>Auditan el DOM contra reglas WCAG 2.1 A/AA y verifican labels/roles accesibles en el frontend (seccion 8.1).</w:t>
             </w:r>
           </w:p>
         </w:tc>
@@ -3648,12 +3695,13 @@
             <w:tcW w:type="dxa" w:w="2160"/>
           </w:tcPr>
           <w:p>
-            <w:r/>
+            <w:r>
+              <w:t>Contenedores Docker locales (uf-postgres/uf-mongo) para no depender de la nube durante las pruebas.</w:t>
+            </w:r>
             <w:r>
               <w:rPr>
                 <w:sz w:val="19"/>
               </w:rPr>
-              <w:t>Testcontainers en local/CI para no depender de la nube durante las pruebas.</w:t>
             </w:r>
           </w:p>
         </w:tc>

</xml_diff>